<commit_message>
Thêm form thẻ Visa khi thanh toán, làm đẹp UI checkout, sửa ảnh đại diện theo tài khoản, cập nhật báo cáo
- CheckoutActivity: hiện form nhập thẻ Visa khi chọn Thẻ/Chuyển khoản; kiểm tra số thẻ (Luhn), hạn thẻ (MM/YY), CVV; tự chèn dấu "/" cho ô hạn thẻ
- Giao diện thanh toán: nền form tương phản, chữ hint rõ hơn (text_hint), padding ngang, chiều cao ô đồng đều, khối chọn phương thức có viền + divider
- AccountManager/EditProfileActivity: lưu ảnh đại diện, SĐT, bio riêng theo từng tài khoản (theo email); file ảnh đặt tên theo email, không còn lẫn giữa các user
- Báo cáo Word: cập nhật ảnh mục 3.8 (form thẻ Visa), sửa mục 3.5, thêm mục Trang quản trị Admin; xoá file backup
- Thêm drawable: bg_card_form, ic_card, divider_thin

Co-Authored-By: Claude Opus 4.8 (1M context) <noreply@anthropic.com>
</commit_message>
<xml_diff>
--- a/BaoCao_JDM_LegendsGarage.docx
+++ b/BaoCao_JDM_LegendsGarage.docx
@@ -106,8 +106,6 @@
         <w:spacing w:before="120" w:after="40"/>
         <w:jc w:val="center"/>
       </w:pPr>
-      <w:bookmarkStart w:id="0" w:name="_GoBack"/>
-      <w:bookmarkEnd w:id="0"/>
     </w:p>
     <w:p/>
     <w:tbl>
@@ -190,12 +188,15 @@
           <w:p>
             <w:pPr>
               <w:spacing w:after="40"/>
-            </w:pPr>
-            <w:r>
-              <w:rPr>
-                <w:sz w:val="24"/>
-              </w:rPr>
-              <w:t>..............................</w:t>
+              <w:rPr>
+                <w:lang w:val="vi-VN"/>
+              </w:rPr>
+            </w:pPr>
+            <w:r>
+              <w:rPr>
+                <w:lang w:val="vi-VN"/>
+              </w:rPr>
+              <w:t>Huỳnh Triệu Minh</w:t>
             </w:r>
           </w:p>
         </w:tc>
@@ -232,10 +233,7 @@
               <w:spacing w:after="40"/>
             </w:pPr>
             <w:r>
-              <w:rPr>
-                <w:sz w:val="24"/>
-              </w:rPr>
-              <w:t>..............................</w:t>
+              <w:t>01008496</w:t>
             </w:r>
           </w:p>
         </w:tc>
@@ -270,12 +268,15 @@
           <w:p>
             <w:pPr>
               <w:spacing w:after="40"/>
-            </w:pPr>
-            <w:r>
-              <w:rPr>
-                <w:sz w:val="24"/>
-              </w:rPr>
-              <w:t>..............................</w:t>
+              <w:rPr>
+                <w:lang w:val="vi-VN"/>
+              </w:rPr>
+            </w:pPr>
+            <w:r>
+              <w:rPr>
+                <w:lang w:val="vi-VN"/>
+              </w:rPr>
+              <w:t>C24_UDPM</w:t>
             </w:r>
           </w:p>
         </w:tc>
@@ -2118,6 +2119,8 @@
           <w:fldChar w:fldCharType="end"/>
         </w:r>
       </w:hyperlink>
+      <w:bookmarkStart w:id="0" w:name="_GoBack"/>
+      <w:bookmarkEnd w:id="0"/>
     </w:p>
     <w:p>
       <w:pPr>
@@ -5526,7 +5529,7 @@
         <w:rPr>
           <w:sz w:val="25"/>
         </w:rPr>
-        <w:t>Ảnh đại diện (Glide) với ảnh dự phòng mặc định</w:t>
+        <w:t>Ảnh đại diện (Glide) lưu riêng theo từng tài khoản (theo email), có ảnh dự phòng mặc định</w:t>
       </w:r>
     </w:p>
     <w:p>
@@ -5562,6 +5565,7 @@
         <w:rPr>
           <w:sz w:val="25"/>
         </w:rPr>
+        <w:lastRenderedPageBreak/>
         <w:t>Danh sách menu: Sửa hồ sơ, Thông báo, Lịch sử đơn hàng, Garage mơ ước, Cài đặt</w:t>
       </w:r>
     </w:p>
@@ -5574,7 +5578,6 @@
         <w:rPr>
           <w:sz w:val="25"/>
         </w:rPr>
-        <w:lastRenderedPageBreak/>
         <w:t>Nút Đăng xuất (MaterialButton) kèm hộp thoại xác nhận</w:t>
       </w:r>
     </w:p>
@@ -5761,6 +5764,7 @@
         <w:rPr>
           <w:sz w:val="25"/>
         </w:rPr>
+        <w:lastRenderedPageBreak/>
         <w:t>Thông báo (Toast) xác nhận đã gửi</w:t>
       </w:r>
     </w:p>
@@ -5773,7 +5777,6 @@
         <w:rPr>
           <w:noProof/>
         </w:rPr>
-        <w:lastRenderedPageBreak/>
         <w:drawing>
           <wp:inline distT="0" distB="0" distL="0" distR="0">
             <wp:extent cx="2232000" cy="3985714"/>
@@ -6135,7 +6138,27 @@
         <w:rPr>
           <w:sz w:val="25"/>
         </w:rPr>
-        <w:t>Nhóm chọn phương thức thanh toán COD / Thẻ (RadioGroup)</w:t>
+        <w:t>Nhóm chọn phương thức thanh toán: COD hoặc Thẻ / Chuyển khoản (RadioGroup)</w:t>
+      </w:r>
+    </w:p>
+    <w:p>
+      <w:pPr>
+        <w:pStyle w:val="ListBullet"/>
+      </w:pPr>
+      <w:r>
+        <w:lastRenderedPageBreak/>
+        <w:t>Form nhập thẻ Visa tự hiện ra khi chọn Thẻ / Chuyển khoản, gồm: số thẻ, tên chủ thẻ, ngày hết hạn (MM/YY) và mã CVV</w:t>
+      </w:r>
+    </w:p>
+    <w:p>
+      <w:pPr>
+        <w:pStyle w:val="ListBullet"/>
+      </w:pPr>
+      <w:r>
+        <w:t>Kiểm tra hợp lệ thông tin thẻ trước khi đặt hàng: số thẻ theo thuật toán Luhn, hạn</w:t>
+      </w:r>
+      <w:r>
+        <w:t xml:space="preserve"> thẻ (chưa hết hạn) và độ dài CVV</w:t>
       </w:r>
     </w:p>
     <w:p>
@@ -6147,7 +6170,6 @@
         <w:rPr>
           <w:sz w:val="25"/>
         </w:rPr>
-        <w:lastRenderedPageBreak/>
         <w:t>Nút Xác nhận đặt hàng (MaterialButton)</w:t>
       </w:r>
     </w:p>
@@ -6278,14 +6300,7 @@
           <w:color w:val="7B1E27"/>
           <w:sz w:val="21"/>
         </w:rPr>
-        <w:t xml:space="preserve">Hình 3.8. </w:t>
-      </w:r>
-      <w:r>
-        <w:rPr>
-          <w:i/>
-          <w:sz w:val="21"/>
-        </w:rPr>
-        <w:t>Màn hình Thanh toán</w:t>
+        <w:t>Hình 3.8. Màn hình Thanh toán — chọn phương thức và form nhập thẻ Visa</w:t>
       </w:r>
     </w:p>
     <w:p>
@@ -10809,12 +10824,76 @@
         <w:pStyle w:val="Heading1"/>
       </w:pPr>
       <w:r>
-        <w:t xml:space="preserve">  CHƯƠNG 6   CẬP NHẬT: LÁI THỬ, ĐỘ ỔN ĐỊNH &amp; KIỂM THỬ TỰ ĐỘNG  </w:t>
-      </w:r>
-    </w:p>
-    <w:p>
-      <w:r>
-        <w:t>Sau khi hoàn thiện các màn hình cốt lõi, nhóm tiếp tục bổ sung một tính năng mới cho khách hàng, củng cố độ ổn định của tầng dữ liệu và xây dựng bộ kiểm thử tự động cùng tài liệu kỹ thuật nhằm nâng cao chất lượng và độ tin cậy của ứng dụng.</w:t>
+        <w:lastRenderedPageBreak/>
+        <w:t xml:space="preserve">  CHƯƠNG 6   C</w:t>
+      </w:r>
+      <w:r>
+        <w:t>Ậ</w:t>
+      </w:r>
+      <w:r>
+        <w:t>P NH</w:t>
+      </w:r>
+      <w:r>
+        <w:t>Ậ</w:t>
+      </w:r>
+      <w:r>
+        <w:t>T: LÁI TH</w:t>
+      </w:r>
+      <w:r>
+        <w:t>Ử</w:t>
+      </w:r>
+      <w:r>
+        <w:t>, Đ</w:t>
+      </w:r>
+      <w:r>
+        <w:t>Ộ</w:t>
+      </w:r>
+      <w:r>
+        <w:t xml:space="preserve"> </w:t>
+      </w:r>
+      <w:r>
+        <w:t>Ổ</w:t>
+      </w:r>
+      <w:r>
+        <w:t>N Đ</w:t>
+      </w:r>
+      <w:r>
+        <w:t>Ị</w:t>
+      </w:r>
+      <w:r>
+        <w:t>NH &amp; KI</w:t>
+      </w:r>
+      <w:r>
+        <w:t>Ể</w:t>
+      </w:r>
+      <w:r>
+        <w:t>M TH</w:t>
+      </w:r>
+      <w:r>
+        <w:t>Ử</w:t>
+      </w:r>
+      <w:r>
+        <w:t xml:space="preserve"> T</w:t>
+      </w:r>
+      <w:r>
+        <w:t>Ự</w:t>
+      </w:r>
+      <w:r>
+        <w:t xml:space="preserve"> Đ</w:t>
+      </w:r>
+      <w:r>
+        <w:t>Ộ</w:t>
+      </w:r>
+      <w:r>
+        <w:t xml:space="preserve">NG  </w:t>
+      </w:r>
+    </w:p>
+    <w:p>
+      <w:r>
+        <w:t xml:space="preserve">Sau khi hoàn thiện các màn hình cốt lõi, nhóm tiếp tục bổ sung một tính năng mới cho khách hàng, củng cố độ ổn định của tầng dữ </w:t>
+      </w:r>
+      <w:r>
+        <w:t>liệu và xây dựng bộ kiểm thử tự động cùng tài liệu kỹ thuật nhằm nâng cao chất lượng và độ tin cậy của ứng dụng.</w:t>
       </w:r>
     </w:p>
     <w:p>
@@ -10822,12 +10901,21 @@
         <w:pStyle w:val="Heading2"/>
       </w:pPr>
       <w:r>
-        <w:t xml:space="preserve">  6.1. Tính năng Đăng ký Lái thử (Test Drive)</w:t>
-      </w:r>
-    </w:p>
-    <w:p>
-      <w:r>
-        <w:t>Từ màn hình Chi tiết xe, người dùng nhấn nút “LÁI THỬ” (đặt cạnh nút Mua) để mở màn hình đăng ký lịch lái thử. Đây là tính năng hướng tới trải nghiệm khách hàng thực tế của một đại lý xe.</w:t>
+        <w:t xml:space="preserve">  6.1. Tính năng Đăng ký Lái th</w:t>
+      </w:r>
+      <w:r>
+        <w:t>ử</w:t>
+      </w:r>
+      <w:r>
+        <w:t xml:space="preserve"> (Test Drive)</w:t>
+      </w:r>
+    </w:p>
+    <w:p>
+      <w:r>
+        <w:t xml:space="preserve">Từ màn hình Chi tiết xe, người dùng nhấn nút “LÁI THỬ” (đặt cạnh nút Mua) để mở màn hình đăng ký </w:t>
+      </w:r>
+      <w:r>
+        <w:t>lịch lái thử. Đây là tính năng hướng tới trải nghiệm khách hàng thực tế của một đại lý xe.</w:t>
       </w:r>
     </w:p>
     <w:p>
@@ -10856,7 +10944,10 @@
         <w:pStyle w:val="ListBullet"/>
       </w:pPr>
       <w:r>
-        <w:t>Chọn Ngày bằng DatePickerDialog (chặn chọn ngày trong quá khứ) và Giờ bằng TimePickerDialog.</w:t>
+        <w:t>Chọn Ngày bằng DatePickerDialog</w:t>
+      </w:r>
+      <w:r>
+        <w:t xml:space="preserve"> (chặn chọn ngày trong quá khứ) và Giờ bằng TimePickerDialog.</w:t>
       </w:r>
     </w:p>
     <w:p>
@@ -10869,7 +10960,10 @@
     </w:p>
     <w:p>
       <w:r>
-        <w:t>Hệ thống kiểm tra hợp lệ (tên không rỗng, số điện thoại đúng định dạng 10 số bắt đầu bằng 0, bắt buộc đã chọn ngày và giờ), sau đó lưu lịch hẹn và hiển thị thông báo xác nhận.</w:t>
+        <w:t xml:space="preserve">Hệ thống kiểm tra hợp lệ (tên không rỗng, số điện thoại đúng định dạng 10 số bắt đầu bằng 0, bắt buộc đã chọn ngày và giờ), sau đó lưu lịch </w:t>
+      </w:r>
+      <w:r>
+        <w:t>hẹn và hiển thị thông báo xác nhận.</w:t>
       </w:r>
     </w:p>
     <w:p>
@@ -10887,7 +10981,10 @@
         <w:pStyle w:val="ListBullet"/>
       </w:pPr>
       <w:r>
-        <w:t>TestDriveActivity.java và layout activity_test_drive.xml — màn hình đặt lịch.</w:t>
+        <w:t>TestDriveActivity.java và layout</w:t>
+      </w:r>
+      <w:r>
+        <w:t xml:space="preserve"> activity_test_drive.xml — màn hình đặt lịch.</w:t>
       </w:r>
     </w:p>
     <w:p>
@@ -10911,7 +11008,10 @@
         <w:pStyle w:val="ListBullet"/>
       </w:pPr>
       <w:r>
-        <w:t>Nút btnTestDrive trong activity_detail_product.xml và khai báo Activity trong AndroidManifest.xml.</w:t>
+        <w:t xml:space="preserve">Nút btnTestDrive trong activity_detail_product.xml và khai báo </w:t>
+      </w:r>
+      <w:r>
+        <w:t>Activity trong AndroidManifest.xml.</w:t>
       </w:r>
     </w:p>
     <w:p>
@@ -10927,108 +11027,259 @@
         <w:pStyle w:val="Heading2"/>
       </w:pPr>
       <w:r>
-        <w:t xml:space="preserve">  6.2. Tăng độ ổn định: đọc dữ liệu an toàn</w:t>
-      </w:r>
-    </w:p>
-    <w:p>
-      <w:r>
-        <w:t>Trước đây, lớp DataManager đọc dữ liệu JSON bằng Gson mà không bắt lỗi. Nếu dữ liệu lưu trong máy bị hỏng hoặc thay đổi cấu trúc, ứng dụng có thể bị dừng đột ngột (crash). Nhóm khắc phục bằng lớp tiện ích JsonSafe với phương thức parseOr: bọc try-catch và xử lý giá trị null, trả về danh sách rỗng khi gặp dữ liệu lỗi.</w:t>
-      </w:r>
-    </w:p>
-    <w:p>
-      <w:pPr>
-        <w:spacing w:after="120"/>
+        <w:lastRenderedPageBreak/>
+        <w:t xml:space="preserve">  6.2. Tăng đ</w:t>
+      </w:r>
+      <w:r>
+        <w:t>ộ</w:t>
+      </w:r>
+      <w:r>
+        <w:t xml:space="preserve"> </w:t>
+      </w:r>
+      <w:r>
+        <w:t>ổ</w:t>
+      </w:r>
+      <w:r>
+        <w:t>n đ</w:t>
+      </w:r>
+      <w:r>
+        <w:t>ị</w:t>
+      </w:r>
+      <w:r>
+        <w:t>nh: đ</w:t>
+      </w:r>
+      <w:r>
+        <w:t>ọ</w:t>
+      </w:r>
+      <w:r>
+        <w:t>c d</w:t>
+      </w:r>
+      <w:r>
+        <w:t>ữ</w:t>
+      </w:r>
+      <w:r>
+        <w:t xml:space="preserve"> li</w:t>
+      </w:r>
+      <w:r>
+        <w:t>ệ</w:t>
+      </w:r>
+      <w:r>
+        <w:t>u an toàn</w:t>
+      </w:r>
+    </w:p>
+    <w:p>
+      <w:r>
+        <w:t>Trước đây, lớp DataManager đọc dữ liệu JSON bằng Gson mà không bắt lỗi. Nếu dữ liệu lưu tro</w:t>
+      </w:r>
+      <w:r>
+        <w:t>ng máy bị hỏng hoặc thay đổi cấu trúc, ứng dụng có thể bị dừng đột ngột (crash). Nhóm khắc phục bằng lớp tiện ích JsonSafe với phương thức parseOr: bọc try-catch và xử lý giá trị null, trả về danh sách rỗng khi gặp dữ liệu lỗi.</w:t>
+      </w:r>
+    </w:p>
+    <w:p>
+      <w:pPr>
         <w:ind w:left="280"/>
       </w:pPr>
       <w:r>
         <w:rPr>
           <w:rFonts w:ascii="Consolas" w:hAnsi="Consolas"/>
-          <w:color w:val="1F2024"/>
           <w:sz w:val="21"/>
         </w:rPr>
-        <w:t>public static &lt;T&gt; T parseOr(Gson gson, String json, Type type, T fallback) {</w:t>
+        <w:t>public static &lt;T&gt; T parseOr(</w:t>
+      </w:r>
+      <w:r>
+        <w:rPr>
+          <w:rFonts w:ascii="Consolas" w:hAnsi="Consolas"/>
+          <w:sz w:val="21"/>
+        </w:rPr>
+        <w:t>Gson gson, String json, Type type, T fallback) {</w:t>
+      </w:r>
+      <w:r>
+        <w:rPr>
+          <w:rFonts w:ascii="Consolas" w:hAnsi="Consolas"/>
+          <w:sz w:val="21"/>
+        </w:rPr>
         <w:br/>
+        <w:t xml:space="preserve">    if (json == null || json.trim().isEmpty()) return fallback;</w:t>
       </w:r>
       <w:r>
         <w:rPr>
           <w:rFonts w:ascii="Consolas" w:hAnsi="Consolas"/>
-          <w:color w:val="1F2024"/>
           <w:sz w:val="21"/>
         </w:rPr>
-        <w:t xml:space="preserve">    if (json == null || json.trim().isEmpty()) return fallback;</w:t>
         <w:br/>
+        <w:t xml:space="preserve">    try {</w:t>
       </w:r>
       <w:r>
         <w:rPr>
           <w:rFonts w:ascii="Consolas" w:hAnsi="Consolas"/>
-          <w:color w:val="1F2024"/>
           <w:sz w:val="21"/>
         </w:rPr>
-        <w:t xml:space="preserve">    try {</w:t>
         <w:br/>
+        <w:t xml:space="preserve">        T value = gson.fromJson(json, type);</w:t>
       </w:r>
       <w:r>
         <w:rPr>
           <w:rFonts w:ascii="Consolas" w:hAnsi="Consolas"/>
-          <w:color w:val="1F2024"/>
           <w:sz w:val="21"/>
         </w:rPr>
-        <w:t xml:space="preserve">        T value = gson.fromJson(json, type);</w:t>
         <w:br/>
+        <w:t xml:space="preserve">        return value != null ? value : fallback;</w:t>
       </w:r>
       <w:r>
         <w:rPr>
           <w:rFonts w:ascii="Consolas" w:hAnsi="Consolas"/>
-          <w:color w:val="1F2024"/>
           <w:sz w:val="21"/>
         </w:rPr>
-        <w:t xml:space="preserve">        return value != null ? value : fallback;</w:t>
         <w:br/>
+        <w:t xml:space="preserve">    } catch (Exception e) {</w:t>
       </w:r>
       <w:r>
         <w:rPr>
           <w:rFonts w:ascii="Consolas" w:hAnsi="Consolas"/>
-          <w:color w:val="1F2024"/>
           <w:sz w:val="21"/>
         </w:rPr>
-        <w:t xml:space="preserve">    } catch (Exception e) {</w:t>
         <w:br/>
+        <w:t xml:space="preserve">        ret</w:t>
       </w:r>
       <w:r>
         <w:rPr>
           <w:rFonts w:ascii="Consolas" w:hAnsi="Consolas"/>
-          <w:color w:val="1F2024"/>
           <w:sz w:val="21"/>
         </w:rPr>
-        <w:t xml:space="preserve">        return fallback;   // dữ liệu hỏng -&gt; không làm sập ứng dụng</w:t>
+        <w:t>urn fallback;   // dữ liệu hỏng -&gt; không làm sập ứng dụng</w:t>
+      </w:r>
+      <w:r>
+        <w:rPr>
+          <w:rFonts w:ascii="Consolas" w:hAnsi="Consolas"/>
+          <w:sz w:val="21"/>
+        </w:rPr>
         <w:br/>
+        <w:t xml:space="preserve">    }</w:t>
       </w:r>
       <w:r>
         <w:rPr>
           <w:rFonts w:ascii="Consolas" w:hAnsi="Consolas"/>
-          <w:color w:val="1F2024"/>
           <w:sz w:val="21"/>
         </w:rPr>
-        <w:t xml:space="preserve">    }</w:t>
         <w:br/>
-      </w:r>
+        <w:t>}</w:t>
+      </w:r>
+    </w:p>
+    <w:p>
+      <w:r>
+        <w:t>Phương thức này được áp dụng cho cả bốn nơi đọc dữ liệu trong DataManager: danh sách yêu thích, giỏ hàng, đơn hàng và đánh giá.</w:t>
+      </w:r>
+    </w:p>
+    <w:p>
+      <w:r>
+        <w:t>Đồng thời, toàn bộ logic kiểm tra dữ liệu nhập được gom về một</w:t>
+      </w:r>
+      <w:r>
+        <w:t xml:space="preserve"> lớp dùng chung Validators (kiểm tra email, mật khẩu, số điện thoại). Nhờ đó các màn hình Đăng nhập, Đăng ký, Thanh toán và Lái thử dùng chung một bộ quy tắc, giảm trùng lặp và dễ kiểm thử.</w:t>
+      </w:r>
+    </w:p>
+    <w:p>
+      <w:pPr>
+        <w:pStyle w:val="Heading2"/>
+      </w:pPr>
+      <w:r>
+        <w:t xml:space="preserve">  6.3. Ki</w:t>
+      </w:r>
+      <w:r>
+        <w:t>ể</w:t>
+      </w:r>
+      <w:r>
+        <w:t>m th</w:t>
+      </w:r>
+      <w:r>
+        <w:t>ử</w:t>
+      </w:r>
+      <w:r>
+        <w:t xml:space="preserve"> t</w:t>
+      </w:r>
+      <w:r>
+        <w:t>ự</w:t>
+      </w:r>
+      <w:r>
+        <w:t xml:space="preserve"> đ</w:t>
+      </w:r>
+      <w:r>
+        <w:t>ộ</w:t>
+      </w:r>
+      <w:r>
+        <w:t>ng (Unit Test)</w:t>
+      </w:r>
+    </w:p>
+    <w:p>
+      <w:r>
+        <w:t xml:space="preserve">Nhóm bổ sung thư viện JUnit 4 </w:t>
+      </w:r>
+      <w:r>
+        <w:t>và viết 11 unit test chạy trực tiếp trên máy ảo Java (JVM), không cần thiết bị hay máy ảo Android, đặt tại thư mục app/src/test/. Các bộ kiểm thử gồm:</w:t>
+      </w:r>
+    </w:p>
+    <w:p>
+      <w:pPr>
+        <w:pStyle w:val="ListBullet"/>
+      </w:pPr>
+      <w:r>
+        <w:t>ValidatorsTest (4 test): email, mật khẩu và số điện thoại — cả trường hợp hợp lệ và không hợp lệ.</w:t>
+      </w:r>
+    </w:p>
+    <w:p>
+      <w:pPr>
+        <w:pStyle w:val="ListBullet"/>
+      </w:pPr>
+      <w:r>
+        <w:t>JsonSaf</w:t>
+      </w:r>
+      <w:r>
+        <w:t>eTest (4 test): JSON hợp lệ được đọc đúng; dữ liệu null, rỗng hoặc hỏng trả về danh sách rỗng (chứng minh không gây crash).</w:t>
+      </w:r>
+    </w:p>
+    <w:p>
+      <w:pPr>
+        <w:pStyle w:val="ListBullet"/>
+      </w:pPr>
+      <w:r>
+        <w:t>DataModelTest (3 test): kiểm tra chuyển đổi qua lại (Gson) cho CarModel, OrderModel và TestDriveBooking.</w:t>
+      </w:r>
+    </w:p>
+    <w:p>
+      <w:r>
+        <w:lastRenderedPageBreak/>
+        <w:t xml:space="preserve">Chạy kiểm thử bằng lệnh và </w:t>
+      </w:r>
+      <w:r>
+        <w:t>kết quả thu được:</w:t>
+      </w:r>
+    </w:p>
+    <w:p>
+      <w:pPr>
+        <w:ind w:left="280"/>
+      </w:pPr>
       <w:r>
         <w:rPr>
           <w:rFonts w:ascii="Consolas" w:hAnsi="Consolas"/>
-          <w:color w:val="1F2024"/>
           <w:sz w:val="21"/>
         </w:rPr>
-        <w:t>}</w:t>
-      </w:r>
-    </w:p>
-    <w:p>
-      <w:r>
-        <w:t>Phương thức này được áp dụng cho cả bốn nơi đọc dữ liệu trong DataManager: danh sách yêu thích, giỏ hàng, đơn hàng và đánh giá.</w:t>
-      </w:r>
-    </w:p>
-    <w:p>
-      <w:r>
-        <w:t>Đồng thời, toàn bộ logic kiểm tra dữ liệu nhập được gom về một lớp dùng chung Validators (kiểm tra email, mật khẩu, số điện thoại). Nhờ đó các màn hình Đăng nhập, Đăng ký, Thanh toán và Lái thử dùng chung một bộ quy tắc, giảm trùng lặp và dễ kiểm thử.</w:t>
+        <w:t>./gradlew test</w:t>
+      </w:r>
+      <w:r>
+        <w:rPr>
+          <w:rFonts w:ascii="Consolas" w:hAnsi="Consolas"/>
+          <w:sz w:val="21"/>
+        </w:rPr>
+        <w:br/>
+        <w:t>BUILD SUCCESSFUL</w:t>
+      </w:r>
+      <w:r>
+        <w:rPr>
+          <w:rFonts w:ascii="Consolas" w:hAnsi="Consolas"/>
+          <w:sz w:val="21"/>
+        </w:rPr>
+        <w:br/>
+        <w:t>11/11 test PASSED  —  0 failures, 0 errors, 0 skipped</w:t>
       </w:r>
     </w:p>
     <w:p>
@@ -11036,86 +11287,27 @@
         <w:pStyle w:val="Heading2"/>
       </w:pPr>
       <w:r>
-        <w:t xml:space="preserve">  6.3. Kiểm thử tự động (Unit Test)</w:t>
-      </w:r>
-    </w:p>
-    <w:p>
-      <w:r>
-        <w:t>Nhóm bổ sung thư viện JUnit 4 và viết 11 unit test chạy trực tiếp trên máy ảo Java (JVM), không cần thiết bị hay máy ảo Android, đặt tại thư mục app/src/test/. Các bộ kiểm thử gồm:</w:t>
-      </w:r>
-    </w:p>
-    <w:p>
-      <w:pPr>
-        <w:pStyle w:val="ListBullet"/>
-      </w:pPr>
-      <w:r>
-        <w:t>ValidatorsTest (4 test): email, mật khẩu và số điện thoại — cả trường hợp hợp lệ và không hợp lệ.</w:t>
-      </w:r>
-    </w:p>
-    <w:p>
-      <w:pPr>
-        <w:pStyle w:val="ListBullet"/>
-      </w:pPr>
-      <w:r>
-        <w:t>JsonSafeTest (4 test): JSON hợp lệ được đọc đúng; dữ liệu null, rỗng hoặc hỏng trả về danh sách rỗng (chứng minh không gây crash).</w:t>
-      </w:r>
-    </w:p>
-    <w:p>
-      <w:pPr>
-        <w:pStyle w:val="ListBullet"/>
-      </w:pPr>
-      <w:r>
-        <w:t>DataModelTest (3 test): kiểm tra chuyển đổi qua lại (Gson) cho CarModel, OrderModel và TestDriveBooking.</w:t>
-      </w:r>
-    </w:p>
-    <w:p>
-      <w:r>
-        <w:t>Chạy kiểm thử bằng lệnh và kết quả thu được:</w:t>
-      </w:r>
-    </w:p>
-    <w:p>
-      <w:pPr>
-        <w:spacing w:after="120"/>
-        <w:ind w:left="280"/>
-      </w:pPr>
-      <w:r>
-        <w:rPr>
-          <w:rFonts w:ascii="Consolas" w:hAnsi="Consolas"/>
-          <w:color w:val="1F2024"/>
-          <w:sz w:val="21"/>
-        </w:rPr>
-        <w:t>./gradlew test</w:t>
-        <w:br/>
-      </w:r>
-      <w:r>
-        <w:rPr>
-          <w:rFonts w:ascii="Consolas" w:hAnsi="Consolas"/>
-          <w:color w:val="1F2024"/>
-          <w:sz w:val="21"/>
-        </w:rPr>
-        <w:t>BUILD SUCCESSFUL</w:t>
-        <w:br/>
-      </w:r>
-      <w:r>
-        <w:rPr>
-          <w:rFonts w:ascii="Consolas" w:hAnsi="Consolas"/>
-          <w:color w:val="1F2024"/>
-          <w:sz w:val="21"/>
-        </w:rPr>
-        <w:t>11/11 test PASSED  —  0 failures, 0 errors, 0 skipped</w:t>
-      </w:r>
-    </w:p>
-    <w:p>
-      <w:pPr>
-        <w:pStyle w:val="Heading2"/>
-      </w:pPr>
-      <w:r>
-        <w:t xml:space="preserve">  6.4. Tài liệu hoá dự án (README)</w:t>
-      </w:r>
-    </w:p>
-    <w:p>
-      <w:r>
-        <w:t>Bổ sung tệp README.md ở thư mục gốc dự án, trình bày: giới thiệu ứng dụng, danh sách tính năng, công nghệ sử dụng, kiến trúc kèm cây thư mục mã nguồn, danh sách API, hướng dẫn build/chạy/kiểm thử, ghi chú về đa ngôn ngữ và các lưu ý bảo mật khi triển khai thực tế.</w:t>
+        <w:t xml:space="preserve">  6.4. Tài li</w:t>
+      </w:r>
+      <w:r>
+        <w:t>ệ</w:t>
+      </w:r>
+      <w:r>
+        <w:t>u hoá d</w:t>
+      </w:r>
+      <w:r>
+        <w:t>ự</w:t>
+      </w:r>
+      <w:r>
+        <w:t xml:space="preserve"> án (README)</w:t>
+      </w:r>
+    </w:p>
+    <w:p>
+      <w:r>
+        <w:t>Bổ sung tệp README.md ở thư mục gốc dự án, trình bày: giới thiệu ứng dụng, danh sách tính năng, công nghệ sử dụng, ki</w:t>
+      </w:r>
+      <w:r>
+        <w:t>ến trúc kèm cây thư mục mã nguồn, danh sách API, hướng dẫn build/chạy/kiểm thử, ghi chú về đa ngôn ngữ và các lưu ý bảo mật khi triển khai thực tế.</w:t>
       </w:r>
     </w:p>
     <w:p>
@@ -13370,12 +13562,6 @@
     <w:lsdException w:name="Book Title" w:uiPriority="33" w:qFormat="1"/>
     <w:lsdException w:name="Bibliography" w:semiHidden="1" w:uiPriority="37" w:unhideWhenUsed="1"/>
     <w:lsdException w:name="TOC Heading" w:semiHidden="1" w:uiPriority="39" w:unhideWhenUsed="1" w:qFormat="1"/>
-    <w:lsdException w:name="Plain Table 4" w:semiHidden="1" w:unhideWhenUsed="1"/>
-    <w:lsdException w:name="Plain Table 5" w:semiHidden="1" w:unhideWhenUsed="1"/>
-    <w:lsdException w:name="Grid Table Light" w:semiHidden="1" w:unhideWhenUsed="1"/>
-    <w:lsdException w:name="Grid Table 1 Light" w:semiHidden="1" w:unhideWhenUsed="1"/>
-    <w:lsdException w:name="Grid Table 2" w:semiHidden="1" w:unhideWhenUsed="1"/>
-    <w:lsdException w:name="Grid Table 3" w:semiHidden="1" w:unhideWhenUsed="1"/>
     <w:lsdException w:name="Grid Table 4" w:uiPriority="49"/>
     <w:lsdException w:name="Grid Table 5 Dark" w:uiPriority="50"/>
     <w:lsdException w:name="Grid Table 6 Colorful" w:uiPriority="51"/>
@@ -24847,7 +25033,7 @@
 </file>
 
 <file path=customXml/itemProps1.xml><?xml version="1.0" encoding="utf-8"?>
-<ds:datastoreItem xmlns:ds="http://schemas.openxmlformats.org/officeDocument/2006/customXml" ds:itemID="{57AB64DF-FA46-9441-B76F-DCF4F27D8932}">
+<ds:datastoreItem xmlns:ds="http://schemas.openxmlformats.org/officeDocument/2006/customXml" ds:itemID="{655E18D4-4F55-8042-BC85-1430EAC53953}">
   <ds:schemaRefs>
     <ds:schemaRef ds:uri="http://schemas.openxmlformats.org/officeDocument/2006/bibliography"/>
   </ds:schemaRefs>

</xml_diff>